<commit_message>
Updated Programming Project Initial Details.docx
</commit_message>
<xml_diff>
--- a/Programming Project Initial Details.docx
+++ b/Programming Project Initial Details.docx
@@ -36,6 +36,7 @@
         </w:rPr>
       </w:pPr>
       <w:r>
+        <w:rPr/>
         <w:t xml:space="preserve"> </w:t>
       </w:r>
       <w:r>
@@ -51,36 +52,64 @@
         <w:ind w:left="720"/>
       </w:pPr>
       <w:r>
-        <w:t>The aim is to solve problems related to the healthcare sector, The healthcare sector is known to be busy and operates under enormous strain as it is driven by high patient demand, particularly from non-emergency patients. Due to this, hospitals must absorb double the patients needed to care, leading to long wait times. The application is to help increase efficiency on administrative tasks so that hospitals can clear non-emergency patients faster, while it is able to spend more time on emergency patients with critical conditions.</w:t>
-      </w:r>
-      <w:r>
+        <w:rPr/>
+        <w:t xml:space="preserve">The healthcare facilities such as hospitals and clinics </w:t>
+      </w:r>
+      <w:r>
+        <w:rPr/>
+        <w:t>are</w:t>
+      </w:r>
+      <w:r>
+        <w:rPr/>
+        <w:t xml:space="preserve"> well known operating under enormous strain, driven by high patient demand as they are the primary points of care where people go for a wide range of health needs. Thus, staff may be busy and find it difficult to </w:t>
+      </w:r>
+      <w:r>
+        <w:rPr/>
+        <w:t>immediately</w:t>
+      </w:r>
+      <w:r>
+        <w:rPr/>
         <w:t xml:space="preserve"> </w:t>
       </w:r>
+      <w:r>
+        <w:rPr/>
+        <w:t>identify</w:t>
+      </w:r>
+      <w:r>
+        <w:rPr/>
+        <w:t xml:space="preserve"> urgent attention. This challenge is greater by the fact that many patients themselves may not fully realize the severity of their symptoms, leading them to seek routine care instead of urgent care. As a result, high patient volume and burnout for medical staff may cause potential delays in critical care for patients whose symptoms worsen while waiting.</w:t>
+      </w:r>
     </w:p>
     <w:p>
       <w:pPr>
         <w:ind w:left="720"/>
       </w:pPr>
       <w:r>
-        <w:t xml:space="preserve">There are </w:t>
-      </w:r>
-      <w:r>
-        <w:t xml:space="preserve">some underlying symptoms that may or may not happen immediately after the </w:t>
-      </w:r>
-      <w:r>
-        <w:t>patient had it, and it might be m</w:t>
-      </w:r>
-      <w:r>
-        <w:t xml:space="preserve">inor or major symptoms. </w:t>
-      </w:r>
-      <w:r>
-        <w:t xml:space="preserve">The application </w:t>
-      </w:r>
-      <w:r>
-        <w:t>is useful to help tho</w:t>
-      </w:r>
-      <w:r>
-        <w:t>se that need medical care and it helps to reduce the demand for non-emergency situations.</w:t>
+        <w:rPr/>
+        <w:t xml:space="preserve">There are some underlying symptoms (mild or severe) may or may not be happen immediately, the application is </w:t>
+      </w:r>
+      <w:r>
+        <w:rPr/>
+        <w:t>useful in</w:t>
+      </w:r>
+      <w:r>
+        <w:rPr/>
+        <w:t xml:space="preserve"> ensuring patients who need urgent attention are spotted and treated more quickly, while the process for </w:t>
+      </w:r>
+      <w:r>
+        <w:rPr/>
+        <w:t>non</w:t>
+      </w:r>
+      <w:r>
+        <w:noBreakHyphen/>
+      </w:r>
+      <w:r>
+        <w:rPr/>
+        <w:t>emergency</w:t>
+      </w:r>
+      <w:r>
+        <w:rPr/>
+        <w:t xml:space="preserve"> care becomes more organized and efficient.</w:t>
       </w:r>
     </w:p>
     <w:p>
@@ -100,7 +129,14 @@
           <w:sz w:val="28"/>
           <w:szCs w:val="28"/>
         </w:rPr>
-        <w:t xml:space="preserve">What </w:t>
+        <w:t>Wh</w:t>
+      </w:r>
+      <w:r>
+        <w:rPr>
+          <w:sz w:val="28"/>
+          <w:szCs w:val="28"/>
+        </w:rPr>
+        <w:t xml:space="preserve">o </w:t>
       </w:r>
       <w:r>
         <w:rPr>
@@ -307,8 +343,10 @@
           <w:ilvl w:val="1"/>
           <w:numId w:val="4"/>
         </w:numPr>
-      </w:pPr>
-      <w:r>
+        <w:rPr/>
+      </w:pPr>
+      <w:r>
+        <w:rPr/>
         <w:t>Drug Allergy</w:t>
       </w:r>
     </w:p>
@@ -565,14 +603,26 @@
           <w:ilvl w:val="2"/>
           <w:numId w:val="1"/>
         </w:numPr>
-      </w:pPr>
-      <w:r>
-        <w:t>If the AI service fails, it will display and error message</w:t>
-      </w:r>
-      <w:r>
+        <w:rPr/>
+      </w:pPr>
+      <w:r>
+        <w:rPr/>
+        <w:t xml:space="preserve">If the AI service fails, it will display </w:t>
+      </w:r>
+      <w:r>
+        <w:rPr/>
+        <w:t>an</w:t>
+      </w:r>
+      <w:r>
+        <w:rPr/>
+        <w:t xml:space="preserve"> error message</w:t>
+      </w:r>
+      <w:r>
+        <w:rPr/>
         <w:t xml:space="preserve"> and </w:t>
       </w:r>
       <w:r>
+        <w:rPr/>
         <w:t>ask the user to reload page or wait for a few minutes if the error persists.</w:t>
       </w:r>
     </w:p>
@@ -783,15 +833,7 @@
         <w:t>If it is an injury</w:t>
       </w:r>
       <w:r>
-        <w:t xml:space="preserve"> </w:t>
-      </w:r>
-      <w:proofErr w:type="spellStart"/>
-      <w:r>
-        <w:t>eg</w:t>
-      </w:r>
-      <w:proofErr w:type="spellEnd"/>
-      <w:r>
-        <w:t xml:space="preserve"> a cut</w:t>
+        <w:t xml:space="preserve"> eg a cut</w:t>
       </w:r>
       <w:r>
         <w:t xml:space="preserve">, </w:t>
@@ -807,7 +849,7 @@
       </w:r>
     </w:p>
     <w:sectPr>
-      <w:pgSz w:w="12240" w:h="15840"/>
+      <w:pgSz w:w="12240" w:h="15840" w:orient="portrait"/>
       <w:pgMar w:top="1440" w:right="1440" w:bottom="1440" w:left="1440" w:header="720" w:footer="720" w:gutter="0"/>
       <w:cols w:space="720"/>
       <w:docGrid w:linePitch="360"/>
@@ -831,7 +873,7 @@
         <w:ind w:left="1080" w:hanging="360"/>
       </w:pPr>
       <w:rPr>
-        <w:rFonts w:ascii="Symbol" w:hAnsi="Symbol" w:hint="default"/>
+        <w:rFonts w:hint="default" w:ascii="Symbol" w:hAnsi="Symbol"/>
       </w:rPr>
     </w:lvl>
     <w:lvl w:ilvl="1" w:tplc="68FE62D8">
@@ -843,7 +885,7 @@
         <w:ind w:left="1800" w:hanging="360"/>
       </w:pPr>
       <w:rPr>
-        <w:rFonts w:ascii="Courier New" w:hAnsi="Courier New" w:hint="default"/>
+        <w:rFonts w:hint="default" w:ascii="Courier New" w:hAnsi="Courier New"/>
       </w:rPr>
     </w:lvl>
     <w:lvl w:ilvl="2" w:tplc="8B2C78B0">
@@ -855,7 +897,7 @@
         <w:ind w:left="2520" w:hanging="360"/>
       </w:pPr>
       <w:rPr>
-        <w:rFonts w:ascii="Wingdings" w:hAnsi="Wingdings" w:hint="default"/>
+        <w:rFonts w:hint="default" w:ascii="Wingdings" w:hAnsi="Wingdings"/>
       </w:rPr>
     </w:lvl>
     <w:lvl w:ilvl="3" w:tplc="570AA9C4">
@@ -867,7 +909,7 @@
         <w:ind w:left="3240" w:hanging="360"/>
       </w:pPr>
       <w:rPr>
-        <w:rFonts w:ascii="Symbol" w:hAnsi="Symbol" w:hint="default"/>
+        <w:rFonts w:hint="default" w:ascii="Symbol" w:hAnsi="Symbol"/>
       </w:rPr>
     </w:lvl>
     <w:lvl w:ilvl="4" w:tplc="6A6E65C4">
@@ -879,7 +921,7 @@
         <w:ind w:left="3960" w:hanging="360"/>
       </w:pPr>
       <w:rPr>
-        <w:rFonts w:ascii="Courier New" w:hAnsi="Courier New" w:hint="default"/>
+        <w:rFonts w:hint="default" w:ascii="Courier New" w:hAnsi="Courier New"/>
       </w:rPr>
     </w:lvl>
     <w:lvl w:ilvl="5" w:tplc="77042FC0">
@@ -891,7 +933,7 @@
         <w:ind w:left="4680" w:hanging="360"/>
       </w:pPr>
       <w:rPr>
-        <w:rFonts w:ascii="Wingdings" w:hAnsi="Wingdings" w:hint="default"/>
+        <w:rFonts w:hint="default" w:ascii="Wingdings" w:hAnsi="Wingdings"/>
       </w:rPr>
     </w:lvl>
     <w:lvl w:ilvl="6" w:tplc="3A9A8F0E">
@@ -903,7 +945,7 @@
         <w:ind w:left="5400" w:hanging="360"/>
       </w:pPr>
       <w:rPr>
-        <w:rFonts w:ascii="Symbol" w:hAnsi="Symbol" w:hint="default"/>
+        <w:rFonts w:hint="default" w:ascii="Symbol" w:hAnsi="Symbol"/>
       </w:rPr>
     </w:lvl>
     <w:lvl w:ilvl="7" w:tplc="902C7154">
@@ -915,7 +957,7 @@
         <w:ind w:left="6120" w:hanging="360"/>
       </w:pPr>
       <w:rPr>
-        <w:rFonts w:ascii="Courier New" w:hAnsi="Courier New" w:hint="default"/>
+        <w:rFonts w:hint="default" w:ascii="Courier New" w:hAnsi="Courier New"/>
       </w:rPr>
     </w:lvl>
     <w:lvl w:ilvl="8" w:tplc="119E5378">
@@ -927,7 +969,7 @@
         <w:ind w:left="6840" w:hanging="360"/>
       </w:pPr>
       <w:rPr>
-        <w:rFonts w:ascii="Wingdings" w:hAnsi="Wingdings" w:hint="default"/>
+        <w:rFonts w:hint="default" w:ascii="Wingdings" w:hAnsi="Wingdings"/>
       </w:rPr>
     </w:lvl>
   </w:abstractNum>
@@ -944,7 +986,7 @@
         <w:ind w:left="1080" w:hanging="360"/>
       </w:pPr>
       <w:rPr>
-        <w:rFonts w:ascii="Symbol" w:hAnsi="Symbol" w:hint="default"/>
+        <w:rFonts w:hint="default" w:ascii="Symbol" w:hAnsi="Symbol"/>
       </w:rPr>
     </w:lvl>
     <w:lvl w:ilvl="1" w:tplc="0FFCA9B8">
@@ -956,7 +998,7 @@
         <w:ind w:left="1800" w:hanging="360"/>
       </w:pPr>
       <w:rPr>
-        <w:rFonts w:ascii="Courier New" w:hAnsi="Courier New" w:hint="default"/>
+        <w:rFonts w:hint="default" w:ascii="Courier New" w:hAnsi="Courier New"/>
       </w:rPr>
     </w:lvl>
     <w:lvl w:ilvl="2" w:tplc="61124AA4">
@@ -968,7 +1010,7 @@
         <w:ind w:left="2520" w:hanging="360"/>
       </w:pPr>
       <w:rPr>
-        <w:rFonts w:ascii="Wingdings" w:hAnsi="Wingdings" w:hint="default"/>
+        <w:rFonts w:hint="default" w:ascii="Wingdings" w:hAnsi="Wingdings"/>
       </w:rPr>
     </w:lvl>
     <w:lvl w:ilvl="3" w:tplc="01625594">
@@ -980,7 +1022,7 @@
         <w:ind w:left="3240" w:hanging="360"/>
       </w:pPr>
       <w:rPr>
-        <w:rFonts w:ascii="Symbol" w:hAnsi="Symbol" w:hint="default"/>
+        <w:rFonts w:hint="default" w:ascii="Symbol" w:hAnsi="Symbol"/>
       </w:rPr>
     </w:lvl>
     <w:lvl w:ilvl="4" w:tplc="93140D6C">
@@ -992,7 +1034,7 @@
         <w:ind w:left="3960" w:hanging="360"/>
       </w:pPr>
       <w:rPr>
-        <w:rFonts w:ascii="Courier New" w:hAnsi="Courier New" w:hint="default"/>
+        <w:rFonts w:hint="default" w:ascii="Courier New" w:hAnsi="Courier New"/>
       </w:rPr>
     </w:lvl>
     <w:lvl w:ilvl="5" w:tplc="6554BCE6">
@@ -1004,7 +1046,7 @@
         <w:ind w:left="4680" w:hanging="360"/>
       </w:pPr>
       <w:rPr>
-        <w:rFonts w:ascii="Wingdings" w:hAnsi="Wingdings" w:hint="default"/>
+        <w:rFonts w:hint="default" w:ascii="Wingdings" w:hAnsi="Wingdings"/>
       </w:rPr>
     </w:lvl>
     <w:lvl w:ilvl="6" w:tplc="55507334">
@@ -1016,7 +1058,7 @@
         <w:ind w:left="5400" w:hanging="360"/>
       </w:pPr>
       <w:rPr>
-        <w:rFonts w:ascii="Symbol" w:hAnsi="Symbol" w:hint="default"/>
+        <w:rFonts w:hint="default" w:ascii="Symbol" w:hAnsi="Symbol"/>
       </w:rPr>
     </w:lvl>
     <w:lvl w:ilvl="7" w:tplc="12A0C9A2">
@@ -1028,7 +1070,7 @@
         <w:ind w:left="6120" w:hanging="360"/>
       </w:pPr>
       <w:rPr>
-        <w:rFonts w:ascii="Courier New" w:hAnsi="Courier New" w:hint="default"/>
+        <w:rFonts w:hint="default" w:ascii="Courier New" w:hAnsi="Courier New"/>
       </w:rPr>
     </w:lvl>
     <w:lvl w:ilvl="8" w:tplc="F1CCB00A">
@@ -1040,7 +1082,7 @@
         <w:ind w:left="6840" w:hanging="360"/>
       </w:pPr>
       <w:rPr>
-        <w:rFonts w:ascii="Wingdings" w:hAnsi="Wingdings" w:hint="default"/>
+        <w:rFonts w:hint="default" w:ascii="Wingdings" w:hAnsi="Wingdings"/>
       </w:rPr>
     </w:lvl>
   </w:abstractNum>
@@ -1057,7 +1099,7 @@
         <w:ind w:left="1080" w:hanging="360"/>
       </w:pPr>
       <w:rPr>
-        <w:rFonts w:ascii="Symbol" w:hAnsi="Symbol" w:hint="default"/>
+        <w:rFonts w:hint="default" w:ascii="Symbol" w:hAnsi="Symbol"/>
       </w:rPr>
     </w:lvl>
     <w:lvl w:ilvl="1" w:tplc="BF1ACF8A">
@@ -1069,7 +1111,7 @@
         <w:ind w:left="1800" w:hanging="360"/>
       </w:pPr>
       <w:rPr>
-        <w:rFonts w:ascii="Courier New" w:hAnsi="Courier New" w:hint="default"/>
+        <w:rFonts w:hint="default" w:ascii="Courier New" w:hAnsi="Courier New"/>
       </w:rPr>
     </w:lvl>
     <w:lvl w:ilvl="2" w:tplc="8CA6584A">
@@ -1081,7 +1123,7 @@
         <w:ind w:left="2520" w:hanging="360"/>
       </w:pPr>
       <w:rPr>
-        <w:rFonts w:ascii="Wingdings" w:hAnsi="Wingdings" w:hint="default"/>
+        <w:rFonts w:hint="default" w:ascii="Wingdings" w:hAnsi="Wingdings"/>
       </w:rPr>
     </w:lvl>
     <w:lvl w:ilvl="3" w:tplc="7BA039A6">
@@ -1093,7 +1135,7 @@
         <w:ind w:left="3240" w:hanging="360"/>
       </w:pPr>
       <w:rPr>
-        <w:rFonts w:ascii="Symbol" w:hAnsi="Symbol" w:hint="default"/>
+        <w:rFonts w:hint="default" w:ascii="Symbol" w:hAnsi="Symbol"/>
       </w:rPr>
     </w:lvl>
     <w:lvl w:ilvl="4" w:tplc="1F38F50A">
@@ -1105,7 +1147,7 @@
         <w:ind w:left="3960" w:hanging="360"/>
       </w:pPr>
       <w:rPr>
-        <w:rFonts w:ascii="Courier New" w:hAnsi="Courier New" w:hint="default"/>
+        <w:rFonts w:hint="default" w:ascii="Courier New" w:hAnsi="Courier New"/>
       </w:rPr>
     </w:lvl>
     <w:lvl w:ilvl="5" w:tplc="28384CF4">
@@ -1117,7 +1159,7 @@
         <w:ind w:left="4680" w:hanging="360"/>
       </w:pPr>
       <w:rPr>
-        <w:rFonts w:ascii="Wingdings" w:hAnsi="Wingdings" w:hint="default"/>
+        <w:rFonts w:hint="default" w:ascii="Wingdings" w:hAnsi="Wingdings"/>
       </w:rPr>
     </w:lvl>
     <w:lvl w:ilvl="6" w:tplc="871E1888">
@@ -1129,7 +1171,7 @@
         <w:ind w:left="5400" w:hanging="360"/>
       </w:pPr>
       <w:rPr>
-        <w:rFonts w:ascii="Symbol" w:hAnsi="Symbol" w:hint="default"/>
+        <w:rFonts w:hint="default" w:ascii="Symbol" w:hAnsi="Symbol"/>
       </w:rPr>
     </w:lvl>
     <w:lvl w:ilvl="7" w:tplc="76CAA636">
@@ -1141,7 +1183,7 @@
         <w:ind w:left="6120" w:hanging="360"/>
       </w:pPr>
       <w:rPr>
-        <w:rFonts w:ascii="Courier New" w:hAnsi="Courier New" w:hint="default"/>
+        <w:rFonts w:hint="default" w:ascii="Courier New" w:hAnsi="Courier New"/>
       </w:rPr>
     </w:lvl>
     <w:lvl w:ilvl="8" w:tplc="0B865148">
@@ -1153,7 +1195,7 @@
         <w:ind w:left="6840" w:hanging="360"/>
       </w:pPr>
       <w:rPr>
-        <w:rFonts w:ascii="Wingdings" w:hAnsi="Wingdings" w:hint="default"/>
+        <w:rFonts w:hint="default" w:ascii="Wingdings" w:hAnsi="Wingdings"/>
       </w:rPr>
     </w:lvl>
   </w:abstractNum>
@@ -1170,7 +1212,7 @@
         <w:ind w:left="1080" w:hanging="360"/>
       </w:pPr>
       <w:rPr>
-        <w:rFonts w:ascii="Symbol" w:hAnsi="Symbol" w:hint="default"/>
+        <w:rFonts w:hint="default" w:ascii="Symbol" w:hAnsi="Symbol"/>
       </w:rPr>
     </w:lvl>
     <w:lvl w:ilvl="1" w:tplc="4564A21A">
@@ -1182,7 +1224,7 @@
         <w:ind w:left="1800" w:hanging="360"/>
       </w:pPr>
       <w:rPr>
-        <w:rFonts w:ascii="Courier New" w:hAnsi="Courier New" w:hint="default"/>
+        <w:rFonts w:hint="default" w:ascii="Courier New" w:hAnsi="Courier New"/>
       </w:rPr>
     </w:lvl>
     <w:lvl w:ilvl="2" w:tplc="5972D0CA">
@@ -1194,7 +1236,7 @@
         <w:ind w:left="2520" w:hanging="360"/>
       </w:pPr>
       <w:rPr>
-        <w:rFonts w:ascii="Wingdings" w:hAnsi="Wingdings" w:hint="default"/>
+        <w:rFonts w:hint="default" w:ascii="Wingdings" w:hAnsi="Wingdings"/>
       </w:rPr>
     </w:lvl>
     <w:lvl w:ilvl="3" w:tplc="69707FC8">
@@ -1206,7 +1248,7 @@
         <w:ind w:left="3240" w:hanging="360"/>
       </w:pPr>
       <w:rPr>
-        <w:rFonts w:ascii="Symbol" w:hAnsi="Symbol" w:hint="default"/>
+        <w:rFonts w:hint="default" w:ascii="Symbol" w:hAnsi="Symbol"/>
       </w:rPr>
     </w:lvl>
     <w:lvl w:ilvl="4" w:tplc="C2D01CDA">
@@ -1218,7 +1260,7 @@
         <w:ind w:left="3960" w:hanging="360"/>
       </w:pPr>
       <w:rPr>
-        <w:rFonts w:ascii="Courier New" w:hAnsi="Courier New" w:hint="default"/>
+        <w:rFonts w:hint="default" w:ascii="Courier New" w:hAnsi="Courier New"/>
       </w:rPr>
     </w:lvl>
     <w:lvl w:ilvl="5" w:tplc="483A456E">
@@ -1230,7 +1272,7 @@
         <w:ind w:left="4680" w:hanging="360"/>
       </w:pPr>
       <w:rPr>
-        <w:rFonts w:ascii="Wingdings" w:hAnsi="Wingdings" w:hint="default"/>
+        <w:rFonts w:hint="default" w:ascii="Wingdings" w:hAnsi="Wingdings"/>
       </w:rPr>
     </w:lvl>
     <w:lvl w:ilvl="6" w:tplc="E650404E">
@@ -1242,7 +1284,7 @@
         <w:ind w:left="5400" w:hanging="360"/>
       </w:pPr>
       <w:rPr>
-        <w:rFonts w:ascii="Symbol" w:hAnsi="Symbol" w:hint="default"/>
+        <w:rFonts w:hint="default" w:ascii="Symbol" w:hAnsi="Symbol"/>
       </w:rPr>
     </w:lvl>
     <w:lvl w:ilvl="7" w:tplc="77E6137A">
@@ -1254,7 +1296,7 @@
         <w:ind w:left="6120" w:hanging="360"/>
       </w:pPr>
       <w:rPr>
-        <w:rFonts w:ascii="Courier New" w:hAnsi="Courier New" w:hint="default"/>
+        <w:rFonts w:hint="default" w:ascii="Courier New" w:hAnsi="Courier New"/>
       </w:rPr>
     </w:lvl>
     <w:lvl w:ilvl="8" w:tplc="747C4CA2">
@@ -1266,7 +1308,7 @@
         <w:ind w:left="6840" w:hanging="360"/>
       </w:pPr>
       <w:rPr>
-        <w:rFonts w:ascii="Wingdings" w:hAnsi="Wingdings" w:hint="default"/>
+        <w:rFonts w:hint="default" w:ascii="Wingdings" w:hAnsi="Wingdings"/>
       </w:rPr>
     </w:lvl>
   </w:abstractNum>
@@ -1283,7 +1325,7 @@
         <w:ind w:left="1080" w:hanging="360"/>
       </w:pPr>
       <w:rPr>
-        <w:rFonts w:ascii="Symbol" w:hAnsi="Symbol" w:hint="default"/>
+        <w:rFonts w:hint="default" w:ascii="Symbol" w:hAnsi="Symbol"/>
       </w:rPr>
     </w:lvl>
     <w:lvl w:ilvl="1" w:tplc="4C6E961C">
@@ -1295,7 +1337,7 @@
         <w:ind w:left="1800" w:hanging="360"/>
       </w:pPr>
       <w:rPr>
-        <w:rFonts w:ascii="Courier New" w:hAnsi="Courier New" w:hint="default"/>
+        <w:rFonts w:hint="default" w:ascii="Courier New" w:hAnsi="Courier New"/>
       </w:rPr>
     </w:lvl>
     <w:lvl w:ilvl="2" w:tplc="43AC8DBA">
@@ -1307,7 +1349,7 @@
         <w:ind w:left="2520" w:hanging="360"/>
       </w:pPr>
       <w:rPr>
-        <w:rFonts w:ascii="Wingdings" w:hAnsi="Wingdings" w:hint="default"/>
+        <w:rFonts w:hint="default" w:ascii="Wingdings" w:hAnsi="Wingdings"/>
       </w:rPr>
     </w:lvl>
     <w:lvl w:ilvl="3" w:tplc="C41CFB4E">
@@ -1319,7 +1361,7 @@
         <w:ind w:left="3240" w:hanging="360"/>
       </w:pPr>
       <w:rPr>
-        <w:rFonts w:ascii="Symbol" w:hAnsi="Symbol" w:hint="default"/>
+        <w:rFonts w:hint="default" w:ascii="Symbol" w:hAnsi="Symbol"/>
       </w:rPr>
     </w:lvl>
     <w:lvl w:ilvl="4" w:tplc="8D600E06">
@@ -1331,7 +1373,7 @@
         <w:ind w:left="3960" w:hanging="360"/>
       </w:pPr>
       <w:rPr>
-        <w:rFonts w:ascii="Courier New" w:hAnsi="Courier New" w:hint="default"/>
+        <w:rFonts w:hint="default" w:ascii="Courier New" w:hAnsi="Courier New"/>
       </w:rPr>
     </w:lvl>
     <w:lvl w:ilvl="5" w:tplc="6E4A7D82">
@@ -1343,7 +1385,7 @@
         <w:ind w:left="4680" w:hanging="360"/>
       </w:pPr>
       <w:rPr>
-        <w:rFonts w:ascii="Wingdings" w:hAnsi="Wingdings" w:hint="default"/>
+        <w:rFonts w:hint="default" w:ascii="Wingdings" w:hAnsi="Wingdings"/>
       </w:rPr>
     </w:lvl>
     <w:lvl w:ilvl="6" w:tplc="6AFA5E4E">
@@ -1355,7 +1397,7 @@
         <w:ind w:left="5400" w:hanging="360"/>
       </w:pPr>
       <w:rPr>
-        <w:rFonts w:ascii="Symbol" w:hAnsi="Symbol" w:hint="default"/>
+        <w:rFonts w:hint="default" w:ascii="Symbol" w:hAnsi="Symbol"/>
       </w:rPr>
     </w:lvl>
     <w:lvl w:ilvl="7" w:tplc="5706F29A">
@@ -1367,7 +1409,7 @@
         <w:ind w:left="6120" w:hanging="360"/>
       </w:pPr>
       <w:rPr>
-        <w:rFonts w:ascii="Courier New" w:hAnsi="Courier New" w:hint="default"/>
+        <w:rFonts w:hint="default" w:ascii="Courier New" w:hAnsi="Courier New"/>
       </w:rPr>
     </w:lvl>
     <w:lvl w:ilvl="8" w:tplc="C0204662">
@@ -1379,7 +1421,7 @@
         <w:ind w:left="6840" w:hanging="360"/>
       </w:pPr>
       <w:rPr>
-        <w:rFonts w:ascii="Wingdings" w:hAnsi="Wingdings" w:hint="default"/>
+        <w:rFonts w:hint="default" w:ascii="Wingdings" w:hAnsi="Wingdings"/>
       </w:rPr>
     </w:lvl>
   </w:abstractNum>
@@ -1485,7 +1527,7 @@
         <w:ind w:left="1080" w:hanging="360"/>
       </w:pPr>
       <w:rPr>
-        <w:rFonts w:ascii="Symbol" w:hAnsi="Symbol" w:hint="default"/>
+        <w:rFonts w:hint="default" w:ascii="Symbol" w:hAnsi="Symbol"/>
       </w:rPr>
     </w:lvl>
     <w:lvl w:ilvl="1" w:tplc="40D23FF8">
@@ -1497,7 +1539,7 @@
         <w:ind w:left="1800" w:hanging="360"/>
       </w:pPr>
       <w:rPr>
-        <w:rFonts w:ascii="Courier New" w:hAnsi="Courier New" w:hint="default"/>
+        <w:rFonts w:hint="default" w:ascii="Courier New" w:hAnsi="Courier New"/>
       </w:rPr>
     </w:lvl>
     <w:lvl w:ilvl="2" w:tplc="6540D4EE">
@@ -1509,7 +1551,7 @@
         <w:ind w:left="2520" w:hanging="360"/>
       </w:pPr>
       <w:rPr>
-        <w:rFonts w:ascii="Wingdings" w:hAnsi="Wingdings" w:hint="default"/>
+        <w:rFonts w:hint="default" w:ascii="Wingdings" w:hAnsi="Wingdings"/>
       </w:rPr>
     </w:lvl>
     <w:lvl w:ilvl="3" w:tplc="486A7B06">
@@ -1521,7 +1563,7 @@
         <w:ind w:left="3240" w:hanging="360"/>
       </w:pPr>
       <w:rPr>
-        <w:rFonts w:ascii="Symbol" w:hAnsi="Symbol" w:hint="default"/>
+        <w:rFonts w:hint="default" w:ascii="Symbol" w:hAnsi="Symbol"/>
       </w:rPr>
     </w:lvl>
     <w:lvl w:ilvl="4" w:tplc="330CBA4A">
@@ -1533,7 +1575,7 @@
         <w:ind w:left="3960" w:hanging="360"/>
       </w:pPr>
       <w:rPr>
-        <w:rFonts w:ascii="Courier New" w:hAnsi="Courier New" w:hint="default"/>
+        <w:rFonts w:hint="default" w:ascii="Courier New" w:hAnsi="Courier New"/>
       </w:rPr>
     </w:lvl>
     <w:lvl w:ilvl="5" w:tplc="5950C2DE">
@@ -1545,7 +1587,7 @@
         <w:ind w:left="4680" w:hanging="360"/>
       </w:pPr>
       <w:rPr>
-        <w:rFonts w:ascii="Wingdings" w:hAnsi="Wingdings" w:hint="default"/>
+        <w:rFonts w:hint="default" w:ascii="Wingdings" w:hAnsi="Wingdings"/>
       </w:rPr>
     </w:lvl>
     <w:lvl w:ilvl="6" w:tplc="4D8EA594">
@@ -1557,7 +1599,7 @@
         <w:ind w:left="5400" w:hanging="360"/>
       </w:pPr>
       <w:rPr>
-        <w:rFonts w:ascii="Symbol" w:hAnsi="Symbol" w:hint="default"/>
+        <w:rFonts w:hint="default" w:ascii="Symbol" w:hAnsi="Symbol"/>
       </w:rPr>
     </w:lvl>
     <w:lvl w:ilvl="7" w:tplc="C1BCFB48">
@@ -1569,7 +1611,7 @@
         <w:ind w:left="6120" w:hanging="360"/>
       </w:pPr>
       <w:rPr>
-        <w:rFonts w:ascii="Courier New" w:hAnsi="Courier New" w:hint="default"/>
+        <w:rFonts w:hint="default" w:ascii="Courier New" w:hAnsi="Courier New"/>
       </w:rPr>
     </w:lvl>
     <w:lvl w:ilvl="8" w:tplc="82349BF8">
@@ -1581,7 +1623,7 @@
         <w:ind w:left="6840" w:hanging="360"/>
       </w:pPr>
       <w:rPr>
-        <w:rFonts w:ascii="Wingdings" w:hAnsi="Wingdings" w:hint="default"/>
+        <w:rFonts w:hint="default" w:ascii="Wingdings" w:hAnsi="Wingdings"/>
       </w:rPr>
     </w:lvl>
   </w:abstractNum>
@@ -1614,7 +1656,7 @@
   <w:docDefaults>
     <w:rPrDefault>
       <w:rPr>
-        <w:rFonts w:asciiTheme="minorHAnsi" w:eastAsiaTheme="minorHAnsi" w:hAnsiTheme="minorHAnsi" w:cstheme="minorBidi"/>
+        <w:rFonts w:asciiTheme="minorHAnsi" w:hAnsiTheme="minorHAnsi" w:eastAsiaTheme="minorHAnsi" w:cstheme="minorBidi"/>
         <w:kern w:val="2"/>
         <w:sz w:val="24"/>
         <w:szCs w:val="24"/>
@@ -1631,14 +1673,14 @@
   <w:latentStyles w:defLockedState="0" w:defUIPriority="99" w:defSemiHidden="0" w:defUnhideWhenUsed="0" w:defQFormat="0" w:count="376">
     <w:lsdException w:name="Normal" w:uiPriority="0" w:qFormat="1"/>
     <w:lsdException w:name="heading 1" w:uiPriority="9" w:qFormat="1"/>
-    <w:lsdException w:name="heading 2" w:semiHidden="1" w:uiPriority="9" w:unhideWhenUsed="1" w:qFormat="1"/>
-    <w:lsdException w:name="heading 3" w:semiHidden="1" w:uiPriority="9" w:unhideWhenUsed="1" w:qFormat="1"/>
-    <w:lsdException w:name="heading 4" w:semiHidden="1" w:uiPriority="9" w:unhideWhenUsed="1" w:qFormat="1"/>
-    <w:lsdException w:name="heading 5" w:semiHidden="1" w:uiPriority="9" w:unhideWhenUsed="1" w:qFormat="1"/>
-    <w:lsdException w:name="heading 6" w:semiHidden="1" w:uiPriority="9" w:unhideWhenUsed="1" w:qFormat="1"/>
-    <w:lsdException w:name="heading 7" w:semiHidden="1" w:uiPriority="9" w:unhideWhenUsed="1" w:qFormat="1"/>
-    <w:lsdException w:name="heading 8" w:semiHidden="1" w:uiPriority="9" w:unhideWhenUsed="1" w:qFormat="1"/>
-    <w:lsdException w:name="heading 9" w:semiHidden="1" w:uiPriority="9" w:unhideWhenUsed="1" w:qFormat="1"/>
+    <w:lsdException w:name="heading 2" w:uiPriority="9" w:semiHidden="1" w:unhideWhenUsed="1" w:qFormat="1"/>
+    <w:lsdException w:name="heading 3" w:uiPriority="9" w:semiHidden="1" w:unhideWhenUsed="1" w:qFormat="1"/>
+    <w:lsdException w:name="heading 4" w:uiPriority="9" w:semiHidden="1" w:unhideWhenUsed="1" w:qFormat="1"/>
+    <w:lsdException w:name="heading 5" w:uiPriority="9" w:semiHidden="1" w:unhideWhenUsed="1" w:qFormat="1"/>
+    <w:lsdException w:name="heading 6" w:uiPriority="9" w:semiHidden="1" w:unhideWhenUsed="1" w:qFormat="1"/>
+    <w:lsdException w:name="heading 7" w:uiPriority="9" w:semiHidden="1" w:unhideWhenUsed="1" w:qFormat="1"/>
+    <w:lsdException w:name="heading 8" w:uiPriority="9" w:semiHidden="1" w:unhideWhenUsed="1" w:qFormat="1"/>
+    <w:lsdException w:name="heading 9" w:uiPriority="9" w:semiHidden="1" w:unhideWhenUsed="1" w:qFormat="1"/>
     <w:lsdException w:name="index 1" w:semiHidden="1" w:unhideWhenUsed="1"/>
     <w:lsdException w:name="index 2" w:semiHidden="1" w:unhideWhenUsed="1"/>
     <w:lsdException w:name="index 3" w:semiHidden="1" w:unhideWhenUsed="1"/>
@@ -1648,22 +1690,22 @@
     <w:lsdException w:name="index 7" w:semiHidden="1" w:unhideWhenUsed="1"/>
     <w:lsdException w:name="index 8" w:semiHidden="1" w:unhideWhenUsed="1"/>
     <w:lsdException w:name="index 9" w:semiHidden="1" w:unhideWhenUsed="1"/>
-    <w:lsdException w:name="toc 1" w:semiHidden="1" w:uiPriority="39" w:unhideWhenUsed="1"/>
-    <w:lsdException w:name="toc 2" w:semiHidden="1" w:uiPriority="39" w:unhideWhenUsed="1"/>
-    <w:lsdException w:name="toc 3" w:semiHidden="1" w:uiPriority="39" w:unhideWhenUsed="1"/>
-    <w:lsdException w:name="toc 4" w:semiHidden="1" w:uiPriority="39" w:unhideWhenUsed="1"/>
-    <w:lsdException w:name="toc 5" w:semiHidden="1" w:uiPriority="39" w:unhideWhenUsed="1"/>
-    <w:lsdException w:name="toc 6" w:semiHidden="1" w:uiPriority="39" w:unhideWhenUsed="1"/>
-    <w:lsdException w:name="toc 7" w:semiHidden="1" w:uiPriority="39" w:unhideWhenUsed="1"/>
-    <w:lsdException w:name="toc 8" w:semiHidden="1" w:uiPriority="39" w:unhideWhenUsed="1"/>
-    <w:lsdException w:name="toc 9" w:semiHidden="1" w:uiPriority="39" w:unhideWhenUsed="1"/>
+    <w:lsdException w:name="toc 1" w:uiPriority="39" w:semiHidden="1" w:unhideWhenUsed="1"/>
+    <w:lsdException w:name="toc 2" w:uiPriority="39" w:semiHidden="1" w:unhideWhenUsed="1"/>
+    <w:lsdException w:name="toc 3" w:uiPriority="39" w:semiHidden="1" w:unhideWhenUsed="1"/>
+    <w:lsdException w:name="toc 4" w:uiPriority="39" w:semiHidden="1" w:unhideWhenUsed="1"/>
+    <w:lsdException w:name="toc 5" w:uiPriority="39" w:semiHidden="1" w:unhideWhenUsed="1"/>
+    <w:lsdException w:name="toc 6" w:uiPriority="39" w:semiHidden="1" w:unhideWhenUsed="1"/>
+    <w:lsdException w:name="toc 7" w:uiPriority="39" w:semiHidden="1" w:unhideWhenUsed="1"/>
+    <w:lsdException w:name="toc 8" w:uiPriority="39" w:semiHidden="1" w:unhideWhenUsed="1"/>
+    <w:lsdException w:name="toc 9" w:uiPriority="39" w:semiHidden="1" w:unhideWhenUsed="1"/>
     <w:lsdException w:name="Normal Indent" w:semiHidden="1" w:unhideWhenUsed="1"/>
     <w:lsdException w:name="footnote text" w:semiHidden="1" w:unhideWhenUsed="1"/>
     <w:lsdException w:name="annotation text" w:semiHidden="1" w:unhideWhenUsed="1"/>
     <w:lsdException w:name="header" w:semiHidden="1" w:unhideWhenUsed="1"/>
     <w:lsdException w:name="footer" w:semiHidden="1" w:unhideWhenUsed="1"/>
     <w:lsdException w:name="index heading" w:semiHidden="1" w:unhideWhenUsed="1"/>
-    <w:lsdException w:name="caption" w:semiHidden="1" w:uiPriority="35" w:unhideWhenUsed="1" w:qFormat="1"/>
+    <w:lsdException w:name="caption" w:uiPriority="35" w:semiHidden="1" w:unhideWhenUsed="1" w:qFormat="1"/>
     <w:lsdException w:name="table of figures" w:semiHidden="1" w:unhideWhenUsed="1"/>
     <w:lsdException w:name="envelope address" w:semiHidden="1" w:unhideWhenUsed="1"/>
     <w:lsdException w:name="envelope return" w:semiHidden="1" w:unhideWhenUsed="1"/>
@@ -1694,7 +1736,7 @@
     <w:lsdException w:name="Title" w:uiPriority="10" w:qFormat="1"/>
     <w:lsdException w:name="Closing" w:semiHidden="1" w:unhideWhenUsed="1"/>
     <w:lsdException w:name="Signature" w:semiHidden="1" w:unhideWhenUsed="1"/>
-    <w:lsdException w:name="Default Paragraph Font" w:semiHidden="1" w:uiPriority="1" w:unhideWhenUsed="1"/>
+    <w:lsdException w:name="Default Paragraph Font" w:uiPriority="1" w:semiHidden="1" w:unhideWhenUsed="1"/>
     <w:lsdException w:name="Body Text" w:semiHidden="1" w:unhideWhenUsed="1"/>
     <w:lsdException w:name="Body Text Indent" w:semiHidden="1" w:unhideWhenUsed="1"/>
     <w:lsdException w:name="List Continue" w:semiHidden="1" w:unhideWhenUsed="1"/>
@@ -1894,8 +1936,8 @@
     <w:lsdException w:name="Subtle Reference" w:uiPriority="31" w:qFormat="1"/>
     <w:lsdException w:name="Intense Reference" w:uiPriority="32" w:qFormat="1"/>
     <w:lsdException w:name="Book Title" w:uiPriority="33" w:qFormat="1"/>
-    <w:lsdException w:name="Bibliography" w:semiHidden="1" w:uiPriority="37" w:unhideWhenUsed="1"/>
-    <w:lsdException w:name="TOC Heading" w:semiHidden="1" w:uiPriority="39" w:unhideWhenUsed="1" w:qFormat="1"/>
+    <w:lsdException w:name="Bibliography" w:uiPriority="37" w:semiHidden="1" w:unhideWhenUsed="1"/>
+    <w:lsdException w:name="TOC Heading" w:uiPriority="39" w:semiHidden="1" w:unhideWhenUsed="1" w:qFormat="1"/>
     <w:lsdException w:name="Plain Table 1" w:uiPriority="41"/>
     <w:lsdException w:name="Plain Table 2" w:uiPriority="42"/>
     <w:lsdException w:name="Plain Table 3" w:uiPriority="43"/>
@@ -2006,7 +2048,7 @@
     <w:lsdException w:name="Unresolved Mention" w:semiHidden="1" w:unhideWhenUsed="1"/>
     <w:lsdException w:name="Smart Link" w:semiHidden="1" w:unhideWhenUsed="1"/>
   </w:latentStyles>
-  <w:style w:type="paragraph" w:default="1" w:styleId="Normal">
+  <w:style w:type="paragraph" w:styleId="Normal" w:default="1">
     <w:name w:val="Normal"/>
     <w:qFormat/>
   </w:style>
@@ -2025,7 +2067,7 @@
       <w:outlineLvl w:val="0"/>
     </w:pPr>
     <w:rPr>
-      <w:rFonts w:asciiTheme="majorHAnsi" w:eastAsiaTheme="majorEastAsia" w:hAnsiTheme="majorHAnsi" w:cstheme="majorBidi"/>
+      <w:rFonts w:asciiTheme="majorHAnsi" w:hAnsiTheme="majorHAnsi" w:eastAsiaTheme="majorEastAsia" w:cstheme="majorBidi"/>
       <w:color w:val="0F4761" w:themeColor="accent1" w:themeShade="BF"/>
       <w:sz w:val="40"/>
       <w:szCs w:val="40"/>
@@ -2048,7 +2090,7 @@
       <w:outlineLvl w:val="1"/>
     </w:pPr>
     <w:rPr>
-      <w:rFonts w:asciiTheme="majorHAnsi" w:eastAsiaTheme="majorEastAsia" w:hAnsiTheme="majorHAnsi" w:cstheme="majorBidi"/>
+      <w:rFonts w:asciiTheme="majorHAnsi" w:hAnsiTheme="majorHAnsi" w:eastAsiaTheme="majorEastAsia" w:cstheme="majorBidi"/>
       <w:color w:val="0F4761" w:themeColor="accent1" w:themeShade="BF"/>
       <w:sz w:val="32"/>
       <w:szCs w:val="32"/>
@@ -2209,13 +2251,13 @@
       <w:color w:val="272727" w:themeColor="text1" w:themeTint="D8"/>
     </w:rPr>
   </w:style>
-  <w:style w:type="character" w:default="1" w:styleId="DefaultParagraphFont">
+  <w:style w:type="character" w:styleId="DefaultParagraphFont" w:default="1">
     <w:name w:val="Default Paragraph Font"/>
     <w:uiPriority w:val="1"/>
     <w:semiHidden/>
     <w:unhideWhenUsed/>
   </w:style>
-  <w:style w:type="table" w:default="1" w:styleId="TableNormal">
+  <w:style w:type="table" w:styleId="TableNormal" w:default="1">
     <w:name w:val="Normal Table"/>
     <w:uiPriority w:val="99"/>
     <w:semiHidden/>
@@ -2230,26 +2272,26 @@
       </w:tblCellMar>
     </w:tblPr>
   </w:style>
-  <w:style w:type="numbering" w:default="1" w:styleId="NoList">
+  <w:style w:type="numbering" w:styleId="NoList" w:default="1">
     <w:name w:val="No List"/>
     <w:uiPriority w:val="99"/>
     <w:semiHidden/>
     <w:unhideWhenUsed/>
   </w:style>
-  <w:style w:type="character" w:customStyle="1" w:styleId="Heading1Char">
+  <w:style w:type="character" w:styleId="Heading1Char" w:customStyle="1">
     <w:name w:val="Heading 1 Char"/>
     <w:basedOn w:val="DefaultParagraphFont"/>
     <w:link w:val="Heading1"/>
     <w:uiPriority w:val="9"/>
     <w:rsid w:val="00D105EB"/>
     <w:rPr>
-      <w:rFonts w:asciiTheme="majorHAnsi" w:eastAsiaTheme="majorEastAsia" w:hAnsiTheme="majorHAnsi" w:cstheme="majorBidi"/>
+      <w:rFonts w:asciiTheme="majorHAnsi" w:hAnsiTheme="majorHAnsi" w:eastAsiaTheme="majorEastAsia" w:cstheme="majorBidi"/>
       <w:color w:val="0F4761" w:themeColor="accent1" w:themeShade="BF"/>
       <w:sz w:val="40"/>
       <w:szCs w:val="40"/>
     </w:rPr>
   </w:style>
-  <w:style w:type="character" w:customStyle="1" w:styleId="Heading2Char">
+  <w:style w:type="character" w:styleId="Heading2Char" w:customStyle="1">
     <w:name w:val="Heading 2 Char"/>
     <w:basedOn w:val="DefaultParagraphFont"/>
     <w:link w:val="Heading2"/>
@@ -2257,13 +2299,13 @@
     <w:semiHidden/>
     <w:rsid w:val="00D105EB"/>
     <w:rPr>
-      <w:rFonts w:asciiTheme="majorHAnsi" w:eastAsiaTheme="majorEastAsia" w:hAnsiTheme="majorHAnsi" w:cstheme="majorBidi"/>
+      <w:rFonts w:asciiTheme="majorHAnsi" w:hAnsiTheme="majorHAnsi" w:eastAsiaTheme="majorEastAsia" w:cstheme="majorBidi"/>
       <w:color w:val="0F4761" w:themeColor="accent1" w:themeShade="BF"/>
       <w:sz w:val="32"/>
       <w:szCs w:val="32"/>
     </w:rPr>
   </w:style>
-  <w:style w:type="character" w:customStyle="1" w:styleId="Heading3Char">
+  <w:style w:type="character" w:styleId="Heading3Char" w:customStyle="1">
     <w:name w:val="Heading 3 Char"/>
     <w:basedOn w:val="DefaultParagraphFont"/>
     <w:link w:val="Heading3"/>
@@ -2277,7 +2319,7 @@
       <w:szCs w:val="28"/>
     </w:rPr>
   </w:style>
-  <w:style w:type="character" w:customStyle="1" w:styleId="Heading4Char">
+  <w:style w:type="character" w:styleId="Heading4Char" w:customStyle="1">
     <w:name w:val="Heading 4 Char"/>
     <w:basedOn w:val="DefaultParagraphFont"/>
     <w:link w:val="Heading4"/>
@@ -2291,7 +2333,7 @@
       <w:color w:val="0F4761" w:themeColor="accent1" w:themeShade="BF"/>
     </w:rPr>
   </w:style>
-  <w:style w:type="character" w:customStyle="1" w:styleId="Heading5Char">
+  <w:style w:type="character" w:styleId="Heading5Char" w:customStyle="1">
     <w:name w:val="Heading 5 Char"/>
     <w:basedOn w:val="DefaultParagraphFont"/>
     <w:link w:val="Heading5"/>
@@ -2303,7 +2345,7 @@
       <w:color w:val="0F4761" w:themeColor="accent1" w:themeShade="BF"/>
     </w:rPr>
   </w:style>
-  <w:style w:type="character" w:customStyle="1" w:styleId="Heading6Char">
+  <w:style w:type="character" w:styleId="Heading6Char" w:customStyle="1">
     <w:name w:val="Heading 6 Char"/>
     <w:basedOn w:val="DefaultParagraphFont"/>
     <w:link w:val="Heading6"/>
@@ -2317,7 +2359,7 @@
       <w:color w:val="595959" w:themeColor="text1" w:themeTint="A6"/>
     </w:rPr>
   </w:style>
-  <w:style w:type="character" w:customStyle="1" w:styleId="Heading7Char">
+  <w:style w:type="character" w:styleId="Heading7Char" w:customStyle="1">
     <w:name w:val="Heading 7 Char"/>
     <w:basedOn w:val="DefaultParagraphFont"/>
     <w:link w:val="Heading7"/>
@@ -2329,7 +2371,7 @@
       <w:color w:val="595959" w:themeColor="text1" w:themeTint="A6"/>
     </w:rPr>
   </w:style>
-  <w:style w:type="character" w:customStyle="1" w:styleId="Heading8Char">
+  <w:style w:type="character" w:styleId="Heading8Char" w:customStyle="1">
     <w:name w:val="Heading 8 Char"/>
     <w:basedOn w:val="DefaultParagraphFont"/>
     <w:link w:val="Heading8"/>
@@ -2343,7 +2385,7 @@
       <w:color w:val="272727" w:themeColor="text1" w:themeTint="D8"/>
     </w:rPr>
   </w:style>
-  <w:style w:type="character" w:customStyle="1" w:styleId="Heading9Char">
+  <w:style w:type="character" w:styleId="Heading9Char" w:customStyle="1">
     <w:name w:val="Heading 9 Char"/>
     <w:basedOn w:val="DefaultParagraphFont"/>
     <w:link w:val="Heading9"/>
@@ -2368,21 +2410,21 @@
       <w:contextualSpacing/>
     </w:pPr>
     <w:rPr>
-      <w:rFonts w:asciiTheme="majorHAnsi" w:eastAsiaTheme="majorEastAsia" w:hAnsiTheme="majorHAnsi" w:cstheme="majorBidi"/>
+      <w:rFonts w:asciiTheme="majorHAnsi" w:hAnsiTheme="majorHAnsi" w:eastAsiaTheme="majorEastAsia" w:cstheme="majorBidi"/>
       <w:spacing w:val="-10"/>
       <w:kern w:val="28"/>
       <w:sz w:val="56"/>
       <w:szCs w:val="56"/>
     </w:rPr>
   </w:style>
-  <w:style w:type="character" w:customStyle="1" w:styleId="TitleChar">
+  <w:style w:type="character" w:styleId="TitleChar" w:customStyle="1">
     <w:name w:val="Title Char"/>
     <w:basedOn w:val="DefaultParagraphFont"/>
     <w:link w:val="Title"/>
     <w:uiPriority w:val="10"/>
     <w:rsid w:val="00D105EB"/>
     <w:rPr>
-      <w:rFonts w:asciiTheme="majorHAnsi" w:eastAsiaTheme="majorEastAsia" w:hAnsiTheme="majorHAnsi" w:cstheme="majorBidi"/>
+      <w:rFonts w:asciiTheme="majorHAnsi" w:hAnsiTheme="majorHAnsi" w:eastAsiaTheme="majorEastAsia" w:cstheme="majorBidi"/>
       <w:spacing w:val="-10"/>
       <w:kern w:val="28"/>
       <w:sz w:val="56"/>
@@ -2410,7 +2452,7 @@
       <w:szCs w:val="28"/>
     </w:rPr>
   </w:style>
-  <w:style w:type="character" w:customStyle="1" w:styleId="SubtitleChar">
+  <w:style w:type="character" w:styleId="SubtitleChar" w:customStyle="1">
     <w:name w:val="Subtitle Char"/>
     <w:basedOn w:val="DefaultParagraphFont"/>
     <w:link w:val="Subtitle"/>
@@ -2442,7 +2484,7 @@
       <w:color w:val="404040" w:themeColor="text1" w:themeTint="BF"/>
     </w:rPr>
   </w:style>
-  <w:style w:type="character" w:customStyle="1" w:styleId="QuoteChar">
+  <w:style w:type="character" w:styleId="QuoteChar" w:customStyle="1">
     <w:name w:val="Quote Char"/>
     <w:basedOn w:val="DefaultParagraphFont"/>
     <w:link w:val="Quote"/>
@@ -2487,8 +2529,8 @@
     <w:rsid w:val="00D105EB"/>
     <w:pPr>
       <w:pBdr>
-        <w:top w:val="single" w:sz="4" w:space="10" w:color="0F4761" w:themeColor="accent1" w:themeShade="BF"/>
-        <w:bottom w:val="single" w:sz="4" w:space="10" w:color="0F4761" w:themeColor="accent1" w:themeShade="BF"/>
+        <w:top w:val="single" w:color="0F4761" w:themeColor="accent1" w:themeShade="BF" w:sz="4" w:space="10"/>
+        <w:bottom w:val="single" w:color="0F4761" w:themeColor="accent1" w:themeShade="BF" w:sz="4" w:space="10"/>
       </w:pBdr>
       <w:spacing w:before="360" w:after="360"/>
       <w:ind w:left="864" w:right="864"/>
@@ -2500,7 +2542,7 @@
       <w:color w:val="0F4761" w:themeColor="accent1" w:themeShade="BF"/>
     </w:rPr>
   </w:style>
-  <w:style w:type="character" w:customStyle="1" w:styleId="IntenseQuoteChar">
+  <w:style w:type="character" w:styleId="IntenseQuoteChar" w:customStyle="1">
     <w:name w:val="Intense Quote Char"/>
     <w:basedOn w:val="DefaultParagraphFont"/>
     <w:link w:val="IntenseQuote"/>
@@ -2530,7 +2572,7 @@
 </file>
 
 <file path=word/theme/theme1.xml><?xml version="1.0" encoding="utf-8"?>
-<a:theme xmlns:a="http://schemas.openxmlformats.org/drawingml/2006/main" name="Office Theme">
+<a:theme xmlns:a="http://schemas.openxmlformats.org/drawingml/2006/main" xmlns:thm15="http://schemas.microsoft.com/office/thememl/2012/main" name="Office Theme">
   <a:themeElements>
     <a:clrScheme name="Office">
       <a:dk1>

</xml_diff>